<commit_message>
Update contact email site-wide: lidareasyscan@gmail.com -> hello@easyscan.asia (EN/TH/RU + build scripts + form mailto fallback); v=136
</commit_message>
<xml_diff>
--- a/EASY_SCAN_CEO_analiz_sayta.docx
+++ b/EASY_SCAN_CEO_analiz_sayta.docx
@@ -84,7 +84,7 @@
           <w:sz w:val="22"/>
           <w:szCs w:val="22"/>
         </w:rPr>
-        <w:t xml:space="preserve">Но с точки зрения продаж сайту не хватает доказательной базы. Нет ни одного показанного кейса, нет цен даже в виде вилки, а весь контакт идёт через личный Gmail вместо корпоративного домена. Для архитекторов и девелоперов, которые в моменте сравнивают несколько подрядчиков, это создаёт лишнее трение уже на этапе первого впечатления — и именно здесь находится основной резерв роста конверсии.</w:t>
+        <w:t xml:space="preserve">Но с точки зрения продаж примерам не хватает подачи. Реальные объекты уже показаны: четыре именных сканирования — The Bay, The Hill, Ameno, Akasha — на странице Gaussian Splatting с интерактивным 3D-просмотром прямо в браузере, плюс видео-примеры процесса на страницах Concepting и Site Monitoring. Но всё это разбросано по отдельным страницам услуг, нигде не собрано в один раздел «Портфолио» и ни разу не подписано отзывом клиента. Добавьте сюда полное отсутствие цен даже в виде вилки и контакт через личный Gmail вместо корпоративного домена — и получится, что для архитекторов и девелоперов, которые в моменте сравнивают несколько подрядчиков, именно первое впечатление создаёт лишнее трение. Здесь и находится основной резерв роста конверсии.</w:t>
       </w:r>
     </w:p>
     <w:p>
@@ -533,7 +533,7 @@
           <w:sz w:val="22"/>
           <w:szCs w:val="22"/>
         </w:rPr>
-        <w:t xml:space="preserve">Главный пробел — полное отсутствие портфолио. Ни одного реализованного проекта, визуализации «было — стало» или отзыва клиента на сайте нет. Для B2B-продажи дорогой услуги девелоперу это критично: люди с бюджетом на инвестиционное решение хотят увидеть, что технология уже сработала на похожем участке, прежде чем платить за Expert-пакет.</w:t>
+        <w:t xml:space="preserve">Портфолио на сайте на самом деле есть, но оно спрятано. На странице Gaussian Splatting выложены четыре именных объекта — The Bay, The Hill, Ameno, Akasha — с интерактивным 3D-просмотром прямо в браузере, а на страницах Concepting и Site Monitoring встроены видео с примерами процесса. Проблема не в отсутствии доказательств, а в том, что они не собраны в одном месте: на сайте нет раздела «Портфолио» или «Кейсы», на который можно сослаться одной ссылкой в переписке с клиентом, и ни один пример не подписан именем клиента или отзывом. Для B2B-продажи дорогой услуги девелоперу важно не просто увидеть красивую 3D-модель, а понять, чей это был проект и как результат повлиял на решение — сейчас это можно узнать, только если случайно долистать нужную страницу услуги до конца.</w:t>
       </w:r>
     </w:p>
     <w:p>
@@ -545,7 +545,7 @@
           <w:sz w:val="22"/>
           <w:szCs w:val="22"/>
         </w:rPr>
-        <w:t xml:space="preserve">Второй пробел — цена. На сайте нет ни одной цифры, даже ориентировочной. Прямой тайский конкурент в этой нише (THE FUTURE 3D) публикует вилки — например, драм-съёмка от 80 000 до 400 000+ бат — и тем самым сам отсеивает нецелевые заявки, экономя время команды на квалификации лидов. Полное отсутствие цены на easyscan.asia работает в обратную сторону: часть посетителей просто уходит, не оставив заявку, потому что не понимает порядок величины.</w:t>
+        <w:t xml:space="preserve">Второй пробел — цена. На сайте нет ни одной цифры, даже ориентировочной. В нише 3D-съёмки в Таиланде цены в принципе редко публикуют открыто — даже реальный локальный игрок вроде iNFRA Corporation (Бангкок, LiDAR-дроны, сертификаты ISO) не даёт вилку на сайте. Но это не довод в пользу того, чтобы молчать о цене, а наоборот: раз в нише почти никто не публикует хотя бы порядок величины, тот, кто сделает это первым, получит заметное отличие и меньше нецелевых заявок. Сейчас часть посетителей easyscan.asia просто уходит, не оставив заявку, потому что не понимает порядок стоимости.</w:t>
       </w:r>
     </w:p>
     <w:p>
@@ -621,7 +621,7 @@
           <w:sz w:val="22"/>
           <w:szCs w:val="22"/>
         </w:rPr>
-        <w:t xml:space="preserve">На тайском рынке уже есть игроки с похожим технологическим стеком — LiDAR, дрон, scan-to-BIM, digital twin, — например THE FUTURE 3D, которые делают ставку на промышленность, гостиничный сектор и объекты наследия, покрывают около 23 локаций по стране и открыто публикуют и цены, и точность съёмки. По охвату и по прозрачности они сейчас выглядят убедительнее.</w:t>
+        <w:t xml:space="preserve">Важная поправка: THE FUTURE 3D, на которую можно было бы сослаться как на тайского конкурента, на деле — американская компания со штаб-квартирой в Майами. Её страница «/locations/thailand/» — программная SEO-страница под гео-запрос, а не признак реального присутствия в стране: ни тайского офиса, ни тайской команды у неё нет, только вставленное вручную название страны в шаблон, который есть и для десятков других городов. Как прямого локального конкурента её использовать нельзя.</w:t>
       </w:r>
     </w:p>
     <w:p>
@@ -633,7 +633,19 @@
           <w:sz w:val="22"/>
           <w:szCs w:val="22"/>
         </w:rPr>
-        <w:t xml:space="preserve">У EASY SCAN другая, более узкая и более сильная ниша — не съёмка сама по себе, а слой принятия решений именно для земельного девелопмента, плюс нетипичные для этого рынка направления вроде Gaussian Splatting, Museum и Education. Это реальное отличие, но сейчас оно не выражено на сайте как явное позиционирование против конкурентов — «мы не геодезисты, мы решаем, что строить и как» звучит только между строк, а должно быть заявлено прямо.</w:t>
+        <w:t xml:space="preserve">Реальный локальный игрок с похожим технологическим стеком — iNFRA Corporation из Бангкока (Rama I Road, Pathum Wan): LiDAR-дроны DJI Zenmuse L3, сертификаты ISO 9001 и ISO 29110, партнёрства с Chulalongkorn, Kasetsart и KMUTT. Но у неё другая ниша — инфраструктурные и инженерные изыскания, по сути B2G и инженерный подряд, а не работа с архитекторами и девелоперами земли под застройку. Цену она тоже не публикует.</w:t>
+      </w:r>
+    </w:p>
+    <w:p>
+      <w:pPr>
+        <w:spacing w:after="200" w:line="320"/>
+      </w:pPr>
+      <w:r>
+        <w:rPr>
+          <w:sz w:val="22"/>
+          <w:szCs w:val="22"/>
+        </w:rPr>
+        <w:t xml:space="preserve">Получается, что у EASY SCAN на тайском рынке пока нет прямого конкурента именно в нише «слой принятия решений для девелопера земли» — соседи либо инженерно-инфраструктурные (iNFRA), либо международные генералисты без реального локального присутствия. Это хорошая позиция, но именно поэтому её стоит застолбить явным сообщением на сайте — «мы не геодезисты, мы решаем, что строить и как» — а не полагаться на то, что посетитель сам считает разницу между съёмкой и решением.</w:t>
       </w:r>
     </w:p>
     <w:p>
@@ -801,7 +813,7 @@
                 <w:sz w:val="20"/>
                 <w:szCs w:val="20"/>
               </w:rPr>
-              <w:t xml:space="preserve">Добавить портфолио: 3–5 проектов (можно демо) с материалами «было / стало»</w:t>
+              <w:t xml:space="preserve">Собрать существующие примеры (4 объекта с Gaussian-страницы + видео с других страниц) в один раздел «Портфолио», доступный с главной</w:t>
             </w:r>
           </w:p>
         </w:tc>
@@ -824,7 +836,7 @@
                 <w:sz w:val="20"/>
                 <w:szCs w:val="20"/>
               </w:rPr>
-              <w:t xml:space="preserve">Снимает главный барьер B2B-продажи — доказательство, что технология работает</w:t>
+              <w:t xml:space="preserve">Доказательства уже есть, но на них нельзя сослаться одной ссылкой — сейчас они теряются внутри страниц услуг</w:t>
             </w:r>
           </w:p>
         </w:tc>
@@ -872,6 +884,77 @@
                 <w:sz w:val="20"/>
                 <w:szCs w:val="20"/>
               </w:rPr>
+              <w:t xml:space="preserve">Добавить отзывы клиентов хотя бы к 2–3 примерам из портфолио</w:t>
+            </w:r>
+          </w:p>
+        </w:tc>
+        <w:tc>
+          <w:tcPr>
+            <w:tcW w:type="dxa" w:w="3850"/>
+            <w:tcMar>
+              <w:top w:type="dxa" w:w="100"/>
+              <w:left w:type="dxa" w:w="120"/>
+              <w:bottom w:type="dxa" w:w="100"/>
+              <w:right w:type="dxa" w:w="120"/>
+            </w:tcMar>
+          </w:tcPr>
+          <w:p>
+            <w:r>
+              <w:rPr>
+                <w:b w:val="false"/>
+                <w:bCs w:val="false"/>
+                <w:color w:val="000000"/>
+                <w:sz w:val="20"/>
+                <w:szCs w:val="20"/>
+              </w:rPr>
+              <w:t xml:space="preserve">Закрывает последний недостающий элемент доверия: модели есть, голоса клиента — нет</w:t>
+            </w:r>
+          </w:p>
+        </w:tc>
+      </w:tr>
+      <w:tr>
+        <w:tc>
+          <w:tcPr>
+            <w:tcW w:type="dxa" w:w="1500"/>
+            <w:tcMar>
+              <w:top w:type="dxa" w:w="100"/>
+              <w:left w:type="dxa" w:w="120"/>
+              <w:bottom w:type="dxa" w:w="100"/>
+              <w:right w:type="dxa" w:w="120"/>
+            </w:tcMar>
+          </w:tcPr>
+          <w:p>
+            <w:r>
+              <w:rPr>
+                <w:b w:val="false"/>
+                <w:bCs w:val="false"/>
+                <w:color w:val="000000"/>
+                <w:sz w:val="20"/>
+                <w:szCs w:val="20"/>
+              </w:rPr>
+              <w:t xml:space="preserve">Высокий</w:t>
+            </w:r>
+          </w:p>
+        </w:tc>
+        <w:tc>
+          <w:tcPr>
+            <w:tcW w:type="dxa" w:w="4000"/>
+            <w:tcMar>
+              <w:top w:type="dxa" w:w="100"/>
+              <w:left w:type="dxa" w:w="120"/>
+              <w:bottom w:type="dxa" w:w="100"/>
+              <w:right w:type="dxa" w:w="120"/>
+            </w:tcMar>
+          </w:tcPr>
+          <w:p>
+            <w:r>
+              <w:rPr>
+                <w:b w:val="false"/>
+                <w:bCs w:val="false"/>
+                <w:color w:val="000000"/>
+                <w:sz w:val="20"/>
+                <w:szCs w:val="20"/>
+              </w:rPr>
               <w:t xml:space="preserve">Опубликовать хотя бы вилку цен для Basic-пакета</w:t>
             </w:r>
           </w:p>
@@ -895,7 +978,7 @@
                 <w:sz w:val="20"/>
                 <w:szCs w:val="20"/>
               </w:rPr>
-              <w:t xml:space="preserve">Снижает трение, отсекает нецелевые заявки, закрывает разрыв с конкурентом</w:t>
+              <w:t xml:space="preserve">Снижает трение и отсекает нецелевые заявки — в нише это почти никто не делает, будет заметным отличием</w:t>
             </w:r>
           </w:p>
         </w:tc>
@@ -1286,7 +1369,7 @@
           <w:sz w:val="22"/>
           <w:szCs w:val="22"/>
         </w:rPr>
-        <w:t xml:space="preserve">Позиционирование и продуктовая логика сайта сильнее, чем у среднего сканирующего подрядчика в регионе — EASY SCAN уже говорит на языке решений, а не оборудования. Слабое место не в стратегии, а в доказательствах: портфолио, цена и технические детали — три вещи, которые превращают «звучит убедительно» в «готов оставить заявку». Это конкретные, недорогие в реализации доработки, а не смена позиционирования.</w:t>
+        <w:t xml:space="preserve">Позиционирование и продуктовая логика сайта сильнее, чем у среднего сканирующего подрядчика в регионе — EASY SCAN уже говорит на языке решений, а не оборудования. Слабое место не в стратегии и не в контенте, а в подаче: примеры реальных объектов есть, но разбросаны по страницам услуг и нигде не сопровождаются отзывом клиента; цены и технических деталей на сайте просто нет. Собрать портфолио в одном месте, добавить отзывы и показать хотя бы вилку цен — три конкретных, недорогих в реализации доработки, которые закрывают разрыв между «звучит убедительно» и «готов оставить заявку».</w:t>
       </w:r>
     </w:p>
     <w:p>
@@ -1315,7 +1398,7 @@
           <w:sz w:val="18"/>
           <w:szCs w:val="18"/>
         </w:rPr>
-        <w:t xml:space="preserve">easyscan.asia — главная страница, About, Contact, Digital Twin · thefuture3d.com — страница Таиланда (использована для конкурентного сравнения).</w:t>
+        <w:t xml:space="preserve">easyscan.asia — главная страница, About, Contact, Digital Twin, Gaussian Splatting, Concepting, Site Monitoring · thefuture3d.com — проверена и отклонена как тайский конкурент (штаб-квартира в Майами, США) · infra-corp.co — реальный локальный игрок (Бангкок), использован для конкурентного контекста.</w:t>
       </w:r>
     </w:p>
     <w:sectPr>

</xml_diff>